<commit_message>
Policy v1.1 draft: mark changes in light blue shading
Co-Authored-By: Claude Fable 5.1 <noreply@anthropic.com>
Claude-Session: https://claude.ai/code/session_01EcDw2RdbzrHBowkHsXKDir
</commit_message>
<xml_diff>
--- a/CTS Bonus Leave Scheme Policy & Procedure 2026 - v1.1 DRAFT.docx
+++ b/CTS Bonus Leave Scheme Policy & Procedure 2026 - v1.1 DRAFT.docx
@@ -291,7 +291,7 @@
                 <w:rFonts w:ascii="Arial" w:cs="Arial" w:eastAsia="Arial" w:hAnsi="Arial"/>
                 <w:sz w:val="20"/>
                 <w:szCs w:val="20"/>
-                <w:highlight w:val="yellow"/>
+                <w:shd w:fill="CFE2F3" w:color="auto" w:val="clear"/>
               </w:rPr>
               <w:t xml:space="preserve">V1.1  Scheme commencement date (27 November 2017) and no-backdating rule added; casual service excluded from qualifying service; Example 3 added  12.10.2026</w:t>
             </w:r>
@@ -347,7 +347,7 @@
                 <w:rFonts w:ascii="Arial" w:cs="Arial" w:eastAsia="Arial" w:hAnsi="Arial"/>
                 <w:sz w:val="20"/>
                 <w:szCs w:val="20"/>
-                <w:highlight w:val="yellow"/>
+                <w:shd w:fill="CFE2F3" w:color="auto" w:val="clear"/>
               </w:rPr>
               <w:t xml:space="preserve">Draft for approval</w:t>
             </w:r>
@@ -403,7 +403,7 @@
                 <w:rFonts w:ascii="Arial" w:cs="Arial" w:eastAsia="Arial" w:hAnsi="Arial"/>
                 <w:sz w:val="20"/>
                 <w:szCs w:val="20"/>
-                <w:highlight w:val="yellow"/>
+                <w:shd w:fill="CFE2F3" w:color="auto" w:val="clear"/>
               </w:rPr>
               <w:t xml:space="preserve">On approval (V1.0 effective 08 September 2026)</w:t>
             </w:r>
@@ -660,7 +660,7 @@
                 <w:rFonts w:ascii="Arial" w:cs="Arial" w:eastAsia="Arial" w:hAnsi="Arial"/>
                 <w:sz w:val="20"/>
                 <w:szCs w:val="20"/>
-                <w:highlight w:val="yellow"/>
+                <w:shd w:fill="CFE2F3" w:color="auto" w:val="clear"/>
               </w:rPr>
               <w:t xml:space="preserve">CTS Additional Leave Bonus Scheme flowchart v2.0 (04/09/25)</w:t>
             </w:r>
@@ -686,7 +686,7 @@
           <w:sz w:val="18"/>
           <w:szCs w:val="18"/>
         </w:rPr>
-        <w:t xml:space="preserve">Text highlighted in yellow is new or changed in V1.1.</w:t>
+        <w:t xml:space="preserve">Text shaded light blue is new or changed in V1.1.</w:t>
       </w:r>
     </w:p>
     <w:p>
@@ -1652,7 +1652,7 @@
                 <w:rFonts w:ascii="Arial" w:cs="Arial" w:eastAsia="Arial" w:hAnsi="Arial"/>
                 <w:sz w:val="20"/>
                 <w:szCs w:val="20"/>
-                <w:highlight w:val="yellow"/>
+                <w:shd w:fill="CFE2F3" w:color="auto" w:val="clear"/>
               </w:rPr>
               <w:t xml:space="preserve">as a full-time or part-time employee</w:t>
             </w:r>
@@ -1669,7 +1669,7 @@
                 <w:rFonts w:ascii="Arial" w:cs="Arial" w:eastAsia="Arial" w:hAnsi="Arial"/>
                 <w:sz w:val="20"/>
                 <w:szCs w:val="20"/>
-                <w:highlight w:val="yellow"/>
+                <w:shd w:fill="CFE2F3" w:color="auto" w:val="clear"/>
               </w:rPr>
               <w:t xml:space="preserve">Where that date is earlier than the Scheme commencement date, the employee’s commencement date for the purposes of this policy is the Scheme commencement date (see Scheme Commencement Date and No Backdating).</w:t>
             </w:r>
@@ -2010,7 +2010,7 @@
                 <w:rFonts w:ascii="Arial" w:cs="Arial" w:eastAsia="Arial" w:hAnsi="Arial"/>
                 <w:sz w:val="20"/>
                 <w:szCs w:val="20"/>
-                <w:highlight w:val="yellow"/>
+                <w:shd w:fill="CFE2F3" w:color="auto" w:val="clear"/>
               </w:rPr>
               <w:t xml:space="preserve">27 November 2017, the date on which the CTS Additional Leave Bonus Scheme was introduced. No qualifying service is counted, and no Bonus Leave accrues, in respect of any period before this date.</w:t>
             </w:r>
@@ -2314,7 +2314,7 @@
           <w:rFonts w:ascii="Arial" w:cs="Arial" w:eastAsia="Arial" w:hAnsi="Arial"/>
           <w:sz w:val="20"/>
           <w:szCs w:val="20"/>
-          <w:highlight w:val="yellow"/>
+          <w:shd w:fill="CFE2F3" w:color="auto" w:val="clear"/>
         </w:rPr>
         <w:t xml:space="preserve">are never backdated or credited for any period before the Scheme commencement date; and</w:t>
       </w:r>
@@ -2539,7 +2539,7 @@
           <w:rFonts w:ascii="Arial" w:cs="Arial" w:eastAsia="Arial" w:hAnsi="Arial"/>
           <w:sz w:val="20"/>
           <w:szCs w:val="20"/>
-          <w:highlight w:val="yellow"/>
+          <w:shd w:fill="CFE2F3" w:color="auto" w:val="clear"/>
         </w:rPr>
         <w:t xml:space="preserve">Qualifying service is counted from the employee’s commencement date as defined in this policy. Periods of casual employment do not count as qualifying service. Where an employee moves from casual employment to full-time or part-time employment, qualifying service is counted from the date the employee became a full-time or part-time employee.</w:t>
       </w:r>
@@ -2696,7 +2696,7 @@
           <w:rFonts w:ascii="Arial" w:cs="Arial" w:eastAsia="Arial" w:hAnsi="Arial"/>
           <w:sz w:val="20"/>
           <w:szCs w:val="20"/>
-          <w:highlight w:val="yellow"/>
+          <w:shd w:fill="CFE2F3" w:color="auto" w:val="clear"/>
         </w:rPr>
         <w:t xml:space="preserve">The Bonus Leave Scheme commenced on 27 November 2017 (the Scheme commencement date). No qualifying service is counted, and no Bonus Leave accrues, in respect of any period before that date.</w:t>
       </w:r>
@@ -2710,7 +2710,7 @@
           <w:rFonts w:ascii="Arial" w:cs="Arial" w:eastAsia="Arial" w:hAnsi="Arial"/>
           <w:sz w:val="20"/>
           <w:szCs w:val="20"/>
-          <w:highlight w:val="yellow"/>
+          <w:shd w:fill="CFE2F3" w:color="auto" w:val="clear"/>
         </w:rPr>
         <w:t xml:space="preserve">Qualifying service is counted from the later of the employee’s commencement date and the Scheme commencement date. An employee whose employment with CTS began before 27 November 2017 is treated for all purposes of this policy as having commenced on 27 November 2017. Service before that date is not counted, and no accrual date or qualifying service milestone is calculated by reference to it.</w:t>
       </w:r>
@@ -2724,7 +2724,7 @@
           <w:rFonts w:ascii="Arial" w:cs="Arial" w:eastAsia="Arial" w:hAnsi="Arial"/>
           <w:sz w:val="20"/>
           <w:szCs w:val="20"/>
-          <w:highlight w:val="yellow"/>
+          <w:shd w:fill="CFE2F3" w:color="auto" w:val="clear"/>
         </w:rPr>
         <w:t xml:space="preserve">For example, an employee who started with CTS on 1 March 2013 is treated as having commenced on 27 November 2017. That employee reaches three years of qualifying service on 27 November 2020 and five years of qualifying service on 27 November 2022, and their accrual dates run from those dates.</w:t>
       </w:r>
@@ -2738,7 +2738,7 @@
           <w:rFonts w:ascii="Arial" w:cs="Arial" w:eastAsia="Arial" w:hAnsi="Arial"/>
           <w:sz w:val="20"/>
           <w:szCs w:val="20"/>
-          <w:highlight w:val="yellow"/>
+          <w:shd w:fill="CFE2F3" w:color="auto" w:val="clear"/>
         </w:rPr>
         <w:t xml:space="preserve">Bonus Leave will not be backdated or credited retrospectively for any period before the Scheme commencement date, or before the qualifying service milestones determined under this policy. Where CTS identifies that a Bonus Leave balance recorded in Employment Hero exceeds the entitlement calculated under this policy, Human Resources will review the balance and determine the correction in accordance with the Recording of Bonus Leave Days section, unless CTS determines otherwise in writing.</w:t>
       </w:r>
@@ -4085,7 +4085,7 @@
           <w:rFonts w:ascii="Arial" w:cs="Arial" w:eastAsia="Arial" w:hAnsi="Arial"/>
           <w:sz w:val="20"/>
           <w:szCs w:val="20"/>
-          <w:highlight w:val="yellow"/>
+          <w:shd w:fill="CFE2F3" w:color="auto" w:val="clear"/>
         </w:rPr>
         <w:t xml:space="preserve">Bonus Leave is recorded in Employment Hero only from the accrual dates determined under this policy. Balances are not backdated to any date before the Scheme commencement date or before the employee’s qualifying service milestones.</w:t>
       </w:r>
@@ -4279,7 +4279,7 @@
           <w:rFonts w:ascii="Arial" w:cs="Arial" w:eastAsia="Arial" w:hAnsi="Arial"/>
           <w:sz w:val="20"/>
           <w:szCs w:val="20"/>
-          <w:highlight w:val="yellow"/>
+          <w:shd w:fill="CFE2F3" w:color="auto" w:val="clear"/>
         </w:rPr>
         <w:t xml:space="preserve">a casual employee does not accrue Bonus Leave days or qualifying service while engaged on a casual basis; and</w:t>
       </w:r>
@@ -6124,7 +6124,7 @@
           <w:rFonts w:ascii="Arial" w:cs="Arial" w:eastAsia="Arial" w:hAnsi="Arial"/>
           <w:sz w:val="20"/>
           <w:szCs w:val="20"/>
-          <w:highlight w:val="yellow"/>
+          <w:shd w:fill="CFE2F3" w:color="auto" w:val="clear"/>
         </w:rPr>
         <w:t xml:space="preserve">Assumption: the employee started with CTS as a full-time employee on 1 March 2013, remains an eligible full-time employee and does not take any extended leave of absence that pauses qualifying service. Because the employee started before 27 November 2017, their commencement date for this policy is 27 November 2017 and service before that date is not counted.</w:t>
       </w:r>
@@ -6227,7 +6227,7 @@
                 <w:rFonts w:ascii="Arial" w:cs="Arial" w:eastAsia="Arial" w:hAnsi="Arial"/>
                 <w:sz w:val="20"/>
                 <w:szCs w:val="20"/>
-                <w:highlight w:val="yellow"/>
+                <w:shd w:fill="CFE2F3" w:color="auto" w:val="clear"/>
               </w:rPr>
               <w:t xml:space="preserve">27 November 2017</w:t>
             </w:r>
@@ -6252,7 +6252,7 @@
                 <w:rFonts w:ascii="Arial" w:cs="Arial" w:eastAsia="Arial" w:hAnsi="Arial"/>
                 <w:sz w:val="20"/>
                 <w:szCs w:val="20"/>
-                <w:highlight w:val="yellow"/>
+                <w:shd w:fill="CFE2F3" w:color="auto" w:val="clear"/>
               </w:rPr>
               <w:t xml:space="preserve">Treated as commencement date. No Bonus Leave accrual.</w:t>
             </w:r>
@@ -6282,7 +6282,7 @@
                 <w:rFonts w:ascii="Arial" w:cs="Arial" w:eastAsia="Arial" w:hAnsi="Arial"/>
                 <w:sz w:val="20"/>
                 <w:szCs w:val="20"/>
-                <w:highlight w:val="yellow"/>
+                <w:shd w:fill="CFE2F3" w:color="auto" w:val="clear"/>
               </w:rPr>
               <w:t xml:space="preserve">27 November 2020 (3 years)</w:t>
             </w:r>
@@ -6307,7 +6307,7 @@
                 <w:rFonts w:ascii="Arial" w:cs="Arial" w:eastAsia="Arial" w:hAnsi="Arial"/>
                 <w:sz w:val="20"/>
                 <w:szCs w:val="20"/>
-                <w:highlight w:val="yellow"/>
+                <w:shd w:fill="CFE2F3" w:color="auto" w:val="clear"/>
               </w:rPr>
               <w:t xml:space="preserve">1 Bonus Leave day</w:t>
             </w:r>
@@ -6337,7 +6337,7 @@
                 <w:rFonts w:ascii="Arial" w:cs="Arial" w:eastAsia="Arial" w:hAnsi="Arial"/>
                 <w:sz w:val="20"/>
                 <w:szCs w:val="20"/>
-                <w:highlight w:val="yellow"/>
+                <w:shd w:fill="CFE2F3" w:color="auto" w:val="clear"/>
               </w:rPr>
               <w:t xml:space="preserve">27 March 2021, 27 July 2021, 27 November 2021, 27 March 2022, 27 July 2022</w:t>
             </w:r>
@@ -6362,7 +6362,7 @@
                 <w:rFonts w:ascii="Arial" w:cs="Arial" w:eastAsia="Arial" w:hAnsi="Arial"/>
                 <w:sz w:val="20"/>
                 <w:szCs w:val="20"/>
-                <w:highlight w:val="yellow"/>
+                <w:shd w:fill="CFE2F3" w:color="auto" w:val="clear"/>
               </w:rPr>
               <w:t xml:space="preserve">1 Bonus Leave day on each date</w:t>
             </w:r>
@@ -6392,7 +6392,7 @@
                 <w:rFonts w:ascii="Arial" w:cs="Arial" w:eastAsia="Arial" w:hAnsi="Arial"/>
                 <w:sz w:val="20"/>
                 <w:szCs w:val="20"/>
-                <w:highlight w:val="yellow"/>
+                <w:shd w:fill="CFE2F3" w:color="auto" w:val="clear"/>
               </w:rPr>
               <w:t xml:space="preserve">27 November 2022 (5 years)</w:t>
             </w:r>
@@ -6417,7 +6417,7 @@
                 <w:rFonts w:ascii="Arial" w:cs="Arial" w:eastAsia="Arial" w:hAnsi="Arial"/>
                 <w:sz w:val="20"/>
                 <w:szCs w:val="20"/>
-                <w:highlight w:val="yellow"/>
+                <w:shd w:fill="CFE2F3" w:color="auto" w:val="clear"/>
               </w:rPr>
               <w:t xml:space="preserve">2 Bonus Leave days</w:t>
             </w:r>
@@ -6447,7 +6447,7 @@
                 <w:rFonts w:ascii="Arial" w:cs="Arial" w:eastAsia="Arial" w:hAnsi="Arial"/>
                 <w:sz w:val="20"/>
                 <w:szCs w:val="20"/>
-                <w:highlight w:val="yellow"/>
+                <w:shd w:fill="CFE2F3" w:color="auto" w:val="clear"/>
               </w:rPr>
               <w:t xml:space="preserve">27 February 2023, 27 May 2023, 27 August 2023</w:t>
             </w:r>
@@ -6472,7 +6472,7 @@
                 <w:rFonts w:ascii="Arial" w:cs="Arial" w:eastAsia="Arial" w:hAnsi="Arial"/>
                 <w:sz w:val="20"/>
                 <w:szCs w:val="20"/>
-                <w:highlight w:val="yellow"/>
+                <w:shd w:fill="CFE2F3" w:color="auto" w:val="clear"/>
               </w:rPr>
               <w:t xml:space="preserve">1 Bonus Leave day on each date</w:t>
             </w:r>
@@ -6502,7 +6502,7 @@
                 <w:rFonts w:ascii="Arial" w:cs="Arial" w:eastAsia="Arial" w:hAnsi="Arial"/>
                 <w:sz w:val="20"/>
                 <w:szCs w:val="20"/>
-                <w:highlight w:val="yellow"/>
+                <w:shd w:fill="CFE2F3" w:color="auto" w:val="clear"/>
               </w:rPr>
               <w:t xml:space="preserve">Each year thereafter</w:t>
             </w:r>
@@ -6527,7 +6527,7 @@
                 <w:rFonts w:ascii="Arial" w:cs="Arial" w:eastAsia="Arial" w:hAnsi="Arial"/>
                 <w:sz w:val="20"/>
                 <w:szCs w:val="20"/>
-                <w:highlight w:val="yellow"/>
+                <w:shd w:fill="CFE2F3" w:color="auto" w:val="clear"/>
               </w:rPr>
               <w:t xml:space="preserve">2 Bonus Leave days on 27 November, then 1 Bonus Leave day every 3 months after that</w:t>
             </w:r>

</xml_diff>